<commit_message>
save work before v3 switch
</commit_message>
<xml_diff>
--- a/verslag.docx
+++ b/verslag.docx
@@ -176,7 +176,7 @@
           <w:sz w:val="20"/>
           <w:shd w:fill="auto" w:val="clear"/>
         </w:rPr>
-        <w:t xml:space="preserve">Datum: Onbekend</w:t>
+        <w:t xml:space="preserve">Datum: 2026-05-27</w:t>
       </w:r>
       <w:r>
         <w:rPr/>
@@ -232,7 +232,7 @@
           <w:sz w:val="20"/>
           <w:shd w:fill="auto" w:val="clear"/>
         </w:rPr>
-        <w:t xml:space="preserve">Datum volgende consult: Over 6 weken; exacte datum in overleg in te plannen</w:t>
+        <w:t xml:space="preserve">Datum volgende consult: Over zes weken</w:t>
       </w:r>
     </w:p>
     <w:p>
@@ -358,21 +358,15 @@
           <w:sz w:val="22"/>
           <w:shd w:fill="auto" w:val="clear"/>
         </w:rPr>
-        <w:t xml:space="preserve">• U ervaart meer energie sinds de start met supplementen</w:t>
+        <w:t xml:space="preserve">• U ervaart sinds het vorige consult meer energie tijdens de dag, waardoor werkzaamheden doorgaans makkelijker vol te houden zijn; bij hoge werkdruk treden nog steeds vermoeidheidsdipjes op die herstel vragen van enkele uren.</w:t>
         <w:br/>
-        <w:t xml:space="preserve">• Minder darmklachten sinds het vorige consult</w:t>
+        <w:t xml:space="preserve">• De darmklachten zijn afgenomen in frequentie en ernst ten opzichte van eerder, maar een opgeblazen gevoel treedt vrijwel dagelijks in de avond op na de avondmaaltijd en belemmert comfort en ontspanning in de avonduren; herstel vindt meestal tijdens de nacht plaats.</w:t>
         <w:br/>
-        <w:t xml:space="preserve">• Slaapkwaliteit is verbeterd, maar er blijven stressklachten door werk</w:t>
+        <w:t xml:space="preserve">• De slaapkwaliteit is verbeterd en nachten voelen vaker herstellend, maar er is aanhoudende stress op het werk die leidt tot variabele nachten en af en toe slechter slapen, met gevolgen voor concentratie en stemming overdag.</w:t>
         <w:br/>
-        <w:t xml:space="preserve">• Opgeblazen gevoel in de avond blijft bestaan</w:t>
+        <w:t xml:space="preserve">• U gebruikt dagelijks twee koppen koffie; dit is een duidelijke trigger die mogelijk bijdraagt aan de variabele slaap en het avondlijke opgeblazen gevoel, en vermindering van de consumptie heeft direct invloed op deze klachten.</w:t>
         <w:br/>
-        <w:t xml:space="preserve">• Voeding is verbeterd: meer groente, blauwe bessen en extra eiwit bij het ontbijt</w:t>
-        <w:br/>
-        <w:t xml:space="preserve">• U drinkt nog dagelijks twee koppen koffie</w:t>
-        <w:br/>
-        <w:t xml:space="preserve">• Magnesium (gebruik: magnesium bisglycinaat) helpt ontspanning en slaap</w:t>
-        <w:br/>
-        <w:t xml:space="preserve">• Pro Omega Ultra visolie wordt goed verdragen</w:t>
+        <w:t xml:space="preserve">• De huidige supplementen worden over het algemeen goed verdragen: Pro Omega Ultra wordt zonder bijwerkingen gebruikt en magnesium bisglycinaat ondersteunt ontspanning voor het slapen, wat bijdraagt aan de ervaren verbetering van de nachtrust.</w:t>
       </w:r>
     </w:p>
     <w:p>
@@ -490,13 +484,9 @@
                 <w:sz w:val="22"/>
                 <w:shd w:fill="auto" w:val="clear"/>
               </w:rPr>
-              <w:t xml:space="preserve">• Beperk koffie geleidelijk tot maximaal 1 kop per dag binnen 2 weken</w:t>
+              <w:t xml:space="preserve">• Verminder koffie geleidelijk: verkort de huidige inname van twee koppen naar één kop na het ontbijt gedurende één week en beoordeel vervolgens effect op avondrust; doel is de prikkel van cafeïne te verminderen omdat deze de avondrust en spijsvertering beïnvloedt.</w:t>
               <w:br/>
-              <w:t xml:space="preserve">• Stop met suiker in warme dranken direct (geen suiker in koffie of thee)</w:t>
-              <w:br/>
-              <w:t xml:space="preserve">• Beperk alcohol: maximaal 1 consumptie per week gedurende de komende 6 weken</w:t>
-              <w:br/>
-              <w:t xml:space="preserve">• Vermijd zware of vette late avondmaaltijden die het opgeblazen gevoel verergeren</w:t>
+              <w:t xml:space="preserve">• Beperk suiker en alcohol in de avond: beperk consumptie van toegevoegde suikers en alcohol in de avond omdat beide de darmwerking en slaapkwaliteit kunnen verstoren; vervang dessert en zoete snacks waar mogelijk door fruit of noten om het risico op avondelijke opgeblazenheid te verlagen.</w:t>
             </w:r>
           </w:p>
           <w:p>
@@ -586,17 +576,11 @@
                 <w:spacing w:val="0"/>
                 <w:shd w:fill="auto" w:val="clear"/>
               </w:rPr>
-              <w:t xml:space="preserve">• Drink minstens 1 liter extra water per dag bovenop uw huidige hoeveelheid</w:t>
+              <w:t xml:space="preserve">• Zet de toegenomen groente-inname en blauwe bessen voort en verspreid deze over de dag; extra eiwitten bij het ontbijt ondersteunen energie en verzadiging gedurende de ochtend en verminderen het risico op zware avondmaaltijden die het opgeblazen gevoel verergeren.</w:t>
               <w:br/>
-              <w:t xml:space="preserve">• Drink bij opstaan direct 2 glazen lauw water</w:t>
+              <w:t xml:space="preserve">• Verhoog de vochtinname gedurende de dag tot minimaal 1,5 liter, verdeeld over de dag en rondom maaltijden; voldoende water verbeteren de darmpassage en kan het opgeblazen gevoel in de avond verminderen.</w:t>
               <w:br/>
-              <w:t xml:space="preserve">• Drink bij het starten van het avondeten 2 glazen lauw water</w:t>
-              <w:br/>
-              <w:t xml:space="preserve">• Voeg per liter water circa 1/4 theelepel goed gejodeerd of zeezout toe als smaak/elektrolyt</w:t>
-              <w:br/>
-              <w:t xml:space="preserve">• Verhoog vezelinname geleidelijk: extra groenteportie bij één maaltijd per dag</w:t>
-              <w:br/>
-              <w:t xml:space="preserve">• Houd uw eiwitinname bij het ontbijt voort (minimaal één eiwitbron per ontbijt)</w:t>
+              <w:t xml:space="preserve">• Let op maaltijdgrootte en -tijd: beperk zware of zeer vezelrijke maaltijden vlak voor het slapen om de kans op avondlijke opgeblazenheid te verkleinen en geef voorkeur aan lichtere maaltijden in de avond.</w:t>
             </w:r>
           </w:p>
           <w:p>
@@ -711,9 +695,9 @@
                 <w:spacing w:val="0"/>
                 <w:shd w:fill="auto" w:val="clear"/>
               </w:rPr>
-              <w:t xml:space="preserve">• Vitamine D-bloedspiegel laten controleren via de huisarts over 6 weken</w:t>
+              <w:t xml:space="preserve">• Laat de vitamine D-spiegel controleren via de huisarts vóór het vervolgconsult over zes weken zodat de actuele bloedwaarde bekend is en de vitamine D3-dosering indien nodig kan worden aangepast.</w:t>
               <w:br/>
-              <w:t xml:space="preserve">• Vervolgconsult bij praktijk over 6 weken om reactie op veranderingen en bloeduitslag te bespreken</w:t>
+              <w:t xml:space="preserve">• Plan het vervolgconsult over zes weken om de werking van de genomen stappen en de supplementen te evalueren en verdere besluiten te nemen over voortzetting of aanpassing van het schema.</w:t>
             </w:r>
           </w:p>
           <w:p>
@@ -804,7 +788,7 @@
                 <w:sz w:val="22"/>
                 <w:shd w:fill="auto" w:val="clear"/>
               </w:rPr>
-              <w:t xml:space="preserve">• Onbekend</w:t>
+              <w:t xml:space="preserve">Onbekend</w:t>
             </w:r>
           </w:p>
           <w:p>
@@ -921,7 +905,7 @@
                 <w:sz w:val="20"/>
                 <w:shd w:fill="auto" w:val="clear"/>
               </w:rPr>
-              <w:t xml:space="preserve">Pro Omega Ultra visolie (Tisso) (Pro Omega Ultra):</w:t>
+              <w:t xml:space="preserve">Pro Omega Ultra visolie van Tisso:</w:t>
             </w:r>
           </w:p>
           <w:p>
@@ -961,7 +945,7 @@
                 <w:sz w:val="20"/>
                 <w:shd w:fill="auto" w:val="clear"/>
               </w:rPr>
-              <w:t xml:space="preserve">Start eerste dagen met 1/2 eetlepel bij een maaltijd</w:t>
+              <w:t xml:space="preserve">Werking: omega-3 vetzuren uit visolie ondersteunen ontstekingsremmende processen en celmembranen, wat bij kan dragen aan vermindering van klachten die samenhangen met vermoeidheid en darmgevoeligheid.</w:t>
             </w:r>
           </w:p>
           <w:p>
@@ -1001,7 +985,7 @@
                 <w:sz w:val="20"/>
                 <w:shd w:fill="auto" w:val="clear"/>
               </w:rPr>
-              <w:t xml:space="preserve">Vervolgens dagelijks 1 eetlepel bij een maaltijd</w:t>
+              <w:t xml:space="preserve">Reden: voortzetting is geïndiceerd omdat u sinds start meer energie en minder darmklachten rapporteert, waardoor continuering kan bijdragen aan behoud en verdere stabilisatie van deze verbeteringen.</w:t>
             </w:r>
           </w:p>
           <w:p>
@@ -1041,7 +1025,7 @@
                 <w:sz w:val="20"/>
                 <w:shd w:fill="auto" w:val="clear"/>
               </w:rPr>
-              <w:t xml:space="preserve">Na openen in de koelkast bewaren</w:t>
+              <w:t xml:space="preserve">Timing: bij het ontbijt gebruiken om opname te optimaliseren en eventuele maagklachten te beperken.</w:t>
             </w:r>
           </w:p>
           <w:p>
@@ -1081,7 +1065,7 @@
                 <w:sz w:val="20"/>
                 <w:shd w:fill="auto" w:val="clear"/>
               </w:rPr>
-              <w:t xml:space="preserve">Houdbaarheid na openen: maximaal 5 weken</w:t>
+              <w:t xml:space="preserve">Opbouw: Onbekend</w:t>
             </w:r>
           </w:p>
           <w:p>
@@ -1121,7 +1105,7 @@
                 <w:sz w:val="20"/>
                 <w:shd w:fill="auto" w:val="clear"/>
               </w:rPr>
-              <w:t xml:space="preserve">1 unit bestaat uit 2 flesjes van 150 ml</w:t>
+              <w:t xml:space="preserve">Wat te verwachten: effecten manifesteren zich geleidelijk over meerdere weken; blijf de verdraagbaarheid monitoren en meld nieuwe maag-darmklachten als die optreden.</w:t>
             </w:r>
           </w:p>
           <w:p>
@@ -1147,6 +1131,84 @@
                 <w:sz w:val="20"/>
                 <w:shd w:fill="auto" w:val="clear"/>
               </w:rPr>
+              <w:t xml:space="preserve"/>
+            </w:r>
+          </w:p>
+          <w:p>
+            <w:pPr>
+              <w:pStyle w:val="Normal"/>
+              <w:bidi w:val="0"/>
+              <w:spacing w:lineRule="auto" w:line="240" w:before="0" w:after="0"/>
+              <w:ind w:hanging="0" w:left="0" w:right="0"/>
+              <w:jc w:val="left"/>
+              <w:rPr>
+                <w:rFonts w:ascii="Calibri" w:hAnsi="Calibri" w:eastAsia="Calibri" w:cs="Calibri"/>
+                <w:color w:val="auto"/>
+                <w:spacing w:val="0"/>
+                <w:sz w:val="20"/>
+                <w:shd w:fill="auto" w:val="clear"/>
+              </w:rPr>
+            </w:pPr>
+            <w:r>
+              <w:rPr>
+                <w:rFonts w:eastAsia="Calibri" w:cs="Calibri"/>
+                <w:color w:val="000000"/>
+                <w:spacing w:val="0"/>
+                <w:sz w:val="20"/>
+                <w:shd w:fill="auto" w:val="clear"/>
+              </w:rPr>
+              <w:t xml:space="preserve"/>
+            </w:r>
+          </w:p>
+          <w:p>
+            <w:pPr>
+              <w:pStyle w:val="Normal"/>
+              <w:bidi w:val="0"/>
+              <w:spacing w:lineRule="auto" w:line="240" w:before="0" w:after="0"/>
+              <w:ind w:hanging="0" w:left="0" w:right="0"/>
+              <w:jc w:val="left"/>
+              <w:rPr>
+                <w:rFonts w:ascii="Calibri" w:hAnsi="Calibri" w:eastAsia="Calibri" w:cs="Calibri"/>
+                <w:color w:val="auto"/>
+                <w:spacing w:val="0"/>
+                <w:sz w:val="20"/>
+                <w:shd w:fill="auto" w:val="clear"/>
+              </w:rPr>
+            </w:pPr>
+            <w:r>
+              <w:rPr>
+                <w:rFonts w:eastAsia="Calibri" w:cs="Calibri"/>
+                <w:color w:val="000000"/>
+                <w:spacing w:val="0"/>
+                <w:sz w:val="20"/>
+                <w:shd w:fill="auto" w:val="clear"/>
+              </w:rPr>
+              <w:t xml:space="preserve">Magnesium bisglycinaat:</w:t>
+            </w:r>
+          </w:p>
+          <w:p>
+            <w:pPr>
+              <w:pStyle w:val="Normal"/>
+              <w:bidi w:val="0"/>
+              <w:spacing w:lineRule="auto" w:line="240" w:before="0" w:after="0"/>
+              <w:ind w:hanging="0" w:left="0" w:right="0"/>
+              <w:jc w:val="left"/>
+              <w:rPr>
+                <w:rFonts w:ascii="Calibri" w:hAnsi="Calibri" w:eastAsia="Calibri" w:cs="Calibri"/>
+                <w:color w:val="auto"/>
+                <w:spacing w:val="0"/>
+                <w:sz w:val="20"/>
+                <w:shd w:fill="auto" w:val="clear"/>
+              </w:rPr>
+            </w:pPr>
+            <w:r>
+              <w:rPr>
+                <w:rFonts w:eastAsia="Calibri" w:cs="Calibri"/>
+                <w:color w:val="000000"/>
+                <w:spacing w:val="0"/>
+                <w:sz w:val="20"/>
+                <w:shd w:fill="auto" w:val="clear"/>
+              </w:rPr>
               <w:t xml:space="preserve"> </w:t>
             </w:r>
             <w:r>
@@ -1161,7 +1223,7 @@
                 <w:sz w:val="20"/>
                 <w:shd w:fill="auto" w:val="clear"/>
               </w:rPr>
-              <w:t xml:space="preserve">Prijs praktijk: €33,26</w:t>
+              <w:t xml:space="preserve">Werking: magnesium bisglycinaat ondersteunt ontspanning van het zenuwstelsel en de spieren en draagt bij aan het proces van inslapen en herstel tijdens de nacht.</w:t>
             </w:r>
           </w:p>
           <w:p>
@@ -1187,6 +1249,166 @@
                 <w:sz w:val="20"/>
                 <w:shd w:fill="auto" w:val="clear"/>
               </w:rPr>
+              <w:t xml:space="preserve"> </w:t>
+            </w:r>
+            <w:r>
+              <w:rPr/>
+              <w:t xml:space="preserve">• </w:t>
+            </w:r>
+            <w:r>
+              <w:rPr>
+                <w:rFonts w:eastAsia="Calibri" w:cs="Calibri"/>
+                <w:color w:val="000000"/>
+                <w:spacing w:val="0"/>
+                <w:sz w:val="20"/>
+                <w:shd w:fill="auto" w:val="clear"/>
+              </w:rPr>
+              <w:t xml:space="preserve">Reden: u ervaart dat magnesium ontspanning en slaap ondersteunt en daardoor heeft het een directe positieve invloed op de ervaren slaapkwaliteit.</w:t>
+            </w:r>
+          </w:p>
+          <w:p>
+            <w:pPr>
+              <w:pStyle w:val="Normal"/>
+              <w:bidi w:val="0"/>
+              <w:spacing w:lineRule="auto" w:line="240" w:before="0" w:after="0"/>
+              <w:ind w:hanging="0" w:left="0" w:right="0"/>
+              <w:jc w:val="left"/>
+              <w:rPr>
+                <w:rFonts w:ascii="Calibri" w:hAnsi="Calibri" w:eastAsia="Calibri" w:cs="Calibri"/>
+                <w:color w:val="auto"/>
+                <w:spacing w:val="0"/>
+                <w:sz w:val="20"/>
+                <w:shd w:fill="auto" w:val="clear"/>
+              </w:rPr>
+            </w:pPr>
+            <w:r>
+              <w:rPr>
+                <w:rFonts w:eastAsia="Calibri" w:cs="Calibri"/>
+                <w:color w:val="000000"/>
+                <w:spacing w:val="0"/>
+                <w:sz w:val="20"/>
+                <w:shd w:fill="auto" w:val="clear"/>
+              </w:rPr>
+              <w:t xml:space="preserve"> </w:t>
+            </w:r>
+            <w:r>
+              <w:rPr/>
+              <w:t xml:space="preserve">• </w:t>
+            </w:r>
+            <w:r>
+              <w:rPr>
+                <w:rFonts w:eastAsia="Calibri" w:cs="Calibri"/>
+                <w:color w:val="000000"/>
+                <w:spacing w:val="0"/>
+                <w:sz w:val="20"/>
+                <w:shd w:fill="auto" w:val="clear"/>
+              </w:rPr>
+              <w:t xml:space="preserve">Timing: te gebruiken voor het slapen, bij voorkeur vlak voor bedtijd om de ontspannende werking te ondersteunen.</w:t>
+            </w:r>
+          </w:p>
+          <w:p>
+            <w:pPr>
+              <w:pStyle w:val="Normal"/>
+              <w:bidi w:val="0"/>
+              <w:spacing w:lineRule="auto" w:line="240" w:before="0" w:after="0"/>
+              <w:ind w:hanging="0" w:left="0" w:right="0"/>
+              <w:jc w:val="left"/>
+              <w:rPr>
+                <w:rFonts w:ascii="Calibri" w:hAnsi="Calibri" w:eastAsia="Calibri" w:cs="Calibri"/>
+                <w:color w:val="auto"/>
+                <w:spacing w:val="0"/>
+                <w:sz w:val="20"/>
+                <w:shd w:fill="auto" w:val="clear"/>
+              </w:rPr>
+            </w:pPr>
+            <w:r>
+              <w:rPr>
+                <w:rFonts w:eastAsia="Calibri" w:cs="Calibri"/>
+                <w:color w:val="000000"/>
+                <w:spacing w:val="0"/>
+                <w:sz w:val="20"/>
+                <w:shd w:fill="auto" w:val="clear"/>
+              </w:rPr>
+              <w:t xml:space="preserve"> </w:t>
+            </w:r>
+            <w:r>
+              <w:rPr/>
+              <w:t xml:space="preserve">• </w:t>
+            </w:r>
+            <w:r>
+              <w:rPr>
+                <w:rFonts w:eastAsia="Calibri" w:cs="Calibri"/>
+                <w:color w:val="000000"/>
+                <w:spacing w:val="0"/>
+                <w:sz w:val="20"/>
+                <w:shd w:fill="auto" w:val="clear"/>
+              </w:rPr>
+              <w:t xml:space="preserve">Opbouw: Onbekend</w:t>
+            </w:r>
+          </w:p>
+          <w:p>
+            <w:pPr>
+              <w:pStyle w:val="Normal"/>
+              <w:bidi w:val="0"/>
+              <w:spacing w:lineRule="auto" w:line="240" w:before="0" w:after="0"/>
+              <w:ind w:hanging="0" w:left="0" w:right="0"/>
+              <w:jc w:val="left"/>
+              <w:rPr>
+                <w:rFonts w:ascii="Calibri" w:hAnsi="Calibri" w:eastAsia="Calibri" w:cs="Calibri"/>
+                <w:color w:val="auto"/>
+                <w:spacing w:val="0"/>
+                <w:sz w:val="20"/>
+                <w:shd w:fill="auto" w:val="clear"/>
+              </w:rPr>
+            </w:pPr>
+            <w:r>
+              <w:rPr>
+                <w:rFonts w:eastAsia="Calibri" w:cs="Calibri"/>
+                <w:color w:val="000000"/>
+                <w:spacing w:val="0"/>
+                <w:sz w:val="20"/>
+                <w:shd w:fill="auto" w:val="clear"/>
+              </w:rPr>
+              <w:t xml:space="preserve"> </w:t>
+            </w:r>
+            <w:r>
+              <w:rPr/>
+              <w:t xml:space="preserve">• </w:t>
+            </w:r>
+            <w:r>
+              <w:rPr>
+                <w:rFonts w:eastAsia="Calibri" w:cs="Calibri"/>
+                <w:color w:val="000000"/>
+                <w:spacing w:val="0"/>
+                <w:sz w:val="20"/>
+                <w:shd w:fill="auto" w:val="clear"/>
+              </w:rPr>
+              <w:t xml:space="preserve">Wat te verwachten: subjectieve verbetering in ontspanning en inslaapkomen kan binnen enkele dagen optreden; structurele verbetering van slaapkwaliteit kan enkele weken nodig hebben.</w:t>
+            </w:r>
+          </w:p>
+          <w:p>
+            <w:pPr>
+              <w:pStyle w:val="Normal"/>
+              <w:bidi w:val="0"/>
+              <w:spacing w:lineRule="auto" w:line="240" w:before="0" w:after="0"/>
+              <w:ind w:hanging="0" w:left="0" w:right="0"/>
+              <w:jc w:val="left"/>
+              <w:rPr>
+                <w:rFonts w:ascii="Calibri" w:hAnsi="Calibri" w:eastAsia="Calibri" w:cs="Calibri"/>
+                <w:color w:val="auto"/>
+                <w:spacing w:val="0"/>
+                <w:sz w:val="20"/>
+                <w:shd w:fill="auto" w:val="clear"/>
+              </w:rPr>
+            </w:pPr>
+            <w:r>
+              <w:rPr>
+                <w:rFonts w:eastAsia="Calibri" w:cs="Calibri"/>
+                <w:color w:val="000000"/>
+                <w:spacing w:val="0"/>
+                <w:sz w:val="20"/>
+                <w:shd w:fill="auto" w:val="clear"/>
+              </w:rPr>
               <w:t xml:space="preserve"/>
             </w:r>
           </w:p>
@@ -1239,7 +1461,7 @@
                 <w:sz w:val="20"/>
                 <w:shd w:fill="auto" w:val="clear"/>
               </w:rPr>
-              <w:t xml:space="preserve">Magnesium bisglycinaat:</w:t>
+              <w:t xml:space="preserve">Vitamine D3:</w:t>
             </w:r>
           </w:p>
           <w:p>
@@ -1279,7 +1501,7 @@
                 <w:sz w:val="20"/>
                 <w:shd w:fill="auto" w:val="clear"/>
               </w:rPr>
-              <w:t xml:space="preserve">Startdosering in het voorgestelde magnesiumprogramma: start met 5 druppels (ionische magnesium richtlijn)</w:t>
+              <w:t xml:space="preserve">Werking: vitamine D3 speelt een rol in calciumhuishouding en diverse cellulaire processen die invloed hebben op energie en immuunfunctie.</w:t>
             </w:r>
           </w:p>
           <w:p>
@@ -1319,7 +1541,7 @@
                 <w:sz w:val="20"/>
                 <w:shd w:fill="auto" w:val="clear"/>
               </w:rPr>
-              <w:t xml:space="preserve">Geleidelijk opbouwen volgens tolerantie; bij bijwerkingen dosis verlagen</w:t>
+              <w:t xml:space="preserve">Reden: voortzetting van vitamine D3 is opgenomen in het schema, maar actuele bloedwaarden ontbreken waardoor controle noodzakelijk is om de dosering te valideren.</w:t>
             </w:r>
           </w:p>
           <w:p>
@@ -1359,7 +1581,7 @@
                 <w:sz w:val="20"/>
                 <w:shd w:fill="auto" w:val="clear"/>
               </w:rPr>
-              <w:t xml:space="preserve">Bewaarvoorschrift: volg verpakking van het product</w:t>
+              <w:t xml:space="preserve">Timing: bij de lunch innemen om consistentie in inname te bevorderen en opname met een vetrijke maaltijd te ondersteunen.</w:t>
             </w:r>
           </w:p>
           <w:p>
@@ -1385,6 +1607,86 @@
                 <w:sz w:val="20"/>
                 <w:shd w:fill="auto" w:val="clear"/>
               </w:rPr>
+              <w:t xml:space="preserve"> </w:t>
+            </w:r>
+            <w:r>
+              <w:rPr/>
+              <w:t xml:space="preserve">• </w:t>
+            </w:r>
+            <w:r>
+              <w:rPr>
+                <w:rFonts w:eastAsia="Calibri" w:cs="Calibri"/>
+                <w:color w:val="000000"/>
+                <w:spacing w:val="0"/>
+                <w:sz w:val="20"/>
+                <w:shd w:fill="auto" w:val="clear"/>
+              </w:rPr>
+              <w:t xml:space="preserve">Opbouw: Onbekend</w:t>
+            </w:r>
+          </w:p>
+          <w:p>
+            <w:pPr>
+              <w:pStyle w:val="Normal"/>
+              <w:bidi w:val="0"/>
+              <w:spacing w:lineRule="auto" w:line="240" w:before="0" w:after="0"/>
+              <w:ind w:hanging="0" w:left="0" w:right="0"/>
+              <w:jc w:val="left"/>
+              <w:rPr>
+                <w:rFonts w:ascii="Calibri" w:hAnsi="Calibri" w:eastAsia="Calibri" w:cs="Calibri"/>
+                <w:color w:val="auto"/>
+                <w:spacing w:val="0"/>
+                <w:sz w:val="20"/>
+                <w:shd w:fill="auto" w:val="clear"/>
+              </w:rPr>
+            </w:pPr>
+            <w:r>
+              <w:rPr>
+                <w:rFonts w:eastAsia="Calibri" w:cs="Calibri"/>
+                <w:color w:val="000000"/>
+                <w:spacing w:val="0"/>
+                <w:sz w:val="20"/>
+                <w:shd w:fill="auto" w:val="clear"/>
+              </w:rPr>
+              <w:t xml:space="preserve"> </w:t>
+            </w:r>
+            <w:r>
+              <w:rPr/>
+              <w:t xml:space="preserve">• </w:t>
+            </w:r>
+            <w:r>
+              <w:rPr>
+                <w:rFonts w:eastAsia="Calibri" w:cs="Calibri"/>
+                <w:color w:val="000000"/>
+                <w:spacing w:val="0"/>
+                <w:sz w:val="20"/>
+                <w:shd w:fill="auto" w:val="clear"/>
+              </w:rPr>
+              <w:t xml:space="preserve">Wat te verwachten: na bepaling van de bloedspiegel kan de huisarts de dosering bevestigen of aanpassen; veranderingen in symptomen zijn afhankelijk van vooraf bestaande tekorten en kunnen variëren.</w:t>
+            </w:r>
+          </w:p>
+          <w:p>
+            <w:pPr>
+              <w:pStyle w:val="Normal"/>
+              <w:bidi w:val="0"/>
+              <w:spacing w:lineRule="auto" w:line="240" w:before="0" w:after="0"/>
+              <w:ind w:hanging="0" w:left="0" w:right="0"/>
+              <w:jc w:val="left"/>
+              <w:rPr>
+                <w:rFonts w:ascii="Calibri" w:hAnsi="Calibri" w:eastAsia="Calibri" w:cs="Calibri"/>
+                <w:color w:val="auto"/>
+                <w:spacing w:val="0"/>
+                <w:sz w:val="20"/>
+                <w:shd w:fill="auto" w:val="clear"/>
+              </w:rPr>
+            </w:pPr>
+            <w:r>
+              <w:rPr>
+                <w:rFonts w:eastAsia="Calibri" w:cs="Calibri"/>
+                <w:color w:val="000000"/>
+                <w:spacing w:val="0"/>
+                <w:sz w:val="20"/>
+                <w:shd w:fill="auto" w:val="clear"/>
+              </w:rPr>
               <w:t xml:space="preserve"/>
             </w:r>
           </w:p>
@@ -1437,7 +1739,7 @@
                 <w:sz w:val="20"/>
                 <w:shd w:fill="auto" w:val="clear"/>
               </w:rPr>
-              <w:t xml:space="preserve">Vitamine D3 (Pro 1000 of gelijkwaardig):</w:t>
+              <w:t xml:space="preserve">Probiotica:</w:t>
             </w:r>
           </w:p>
           <w:p>
@@ -1477,7 +1779,7 @@
                 <w:sz w:val="20"/>
                 <w:shd w:fill="auto" w:val="clear"/>
               </w:rPr>
-              <w:t xml:space="preserve">Dagelijkse dosering: 1 druppel per dag (25 mcg / 1000 I.E. variant)</w:t>
+              <w:t xml:space="preserve">Werking: probiotica ondersteunen de samenstelling en functie van de darmmicrobiota, wat de spijsvertering en het opgeblazen gevoel kan beïnvloeden.</w:t>
             </w:r>
           </w:p>
           <w:p>
@@ -1517,7 +1819,7 @@
                 <w:sz w:val="20"/>
                 <w:shd w:fill="auto" w:val="clear"/>
               </w:rPr>
-              <w:t xml:space="preserve">In de wintermaanden kan de dosering tijdelijk verhoogd worden naar 2 druppels per dag</w:t>
+              <w:t xml:space="preserve">Reden: inzet van probiotica is bedoeld om de reeds verbeterde darmklachten verder te ondersteunen en de avondlijke opgeblazenheid te verminderen.</w:t>
             </w:r>
           </w:p>
           <w:p>
@@ -1557,7 +1859,7 @@
                 <w:sz w:val="20"/>
                 <w:shd w:fill="auto" w:val="clear"/>
               </w:rPr>
-              <w:t xml:space="preserve">Flesje 15 ml beschikbaar in praktijk (indien gekozen: prijs praktijk €28,86)</w:t>
+              <w:t xml:space="preserve">Timing: te gebruiken voor het ontbijt om opname en dagelijkse innameconsistentie te minimaliseren.</w:t>
             </w:r>
           </w:p>
           <w:p>
@@ -1597,7 +1899,7 @@
                 <w:sz w:val="20"/>
                 <w:shd w:fill="auto" w:val="clear"/>
               </w:rPr>
-              <w:t xml:space="preserve">Controleer de bloedspiegel na 6 weken via huisarts</w:t>
+              <w:t xml:space="preserve">Opbouw: Onbekend</w:t>
             </w:r>
           </w:p>
           <w:p>
@@ -1623,84 +1925,6 @@
                 <w:sz w:val="20"/>
                 <w:shd w:fill="auto" w:val="clear"/>
               </w:rPr>
-              <w:t xml:space="preserve"/>
-            </w:r>
-          </w:p>
-          <w:p>
-            <w:pPr>
-              <w:pStyle w:val="Normal"/>
-              <w:bidi w:val="0"/>
-              <w:spacing w:lineRule="auto" w:line="240" w:before="0" w:after="0"/>
-              <w:ind w:hanging="0" w:left="0" w:right="0"/>
-              <w:jc w:val="left"/>
-              <w:rPr>
-                <w:rFonts w:ascii="Calibri" w:hAnsi="Calibri" w:eastAsia="Calibri" w:cs="Calibri"/>
-                <w:color w:val="auto"/>
-                <w:spacing w:val="0"/>
-                <w:sz w:val="20"/>
-                <w:shd w:fill="auto" w:val="clear"/>
-              </w:rPr>
-            </w:pPr>
-            <w:r>
-              <w:rPr>
-                <w:rFonts w:eastAsia="Calibri" w:cs="Calibri"/>
-                <w:color w:val="000000"/>
-                <w:spacing w:val="0"/>
-                <w:sz w:val="20"/>
-                <w:shd w:fill="auto" w:val="clear"/>
-              </w:rPr>
-              <w:t xml:space="preserve"/>
-            </w:r>
-          </w:p>
-          <w:p>
-            <w:pPr>
-              <w:pStyle w:val="Normal"/>
-              <w:bidi w:val="0"/>
-              <w:spacing w:lineRule="auto" w:line="240" w:before="0" w:after="0"/>
-              <w:ind w:hanging="0" w:left="0" w:right="0"/>
-              <w:jc w:val="left"/>
-              <w:rPr>
-                <w:rFonts w:ascii="Calibri" w:hAnsi="Calibri" w:eastAsia="Calibri" w:cs="Calibri"/>
-                <w:color w:val="auto"/>
-                <w:spacing w:val="0"/>
-                <w:sz w:val="20"/>
-                <w:shd w:fill="auto" w:val="clear"/>
-              </w:rPr>
-            </w:pPr>
-            <w:r>
-              <w:rPr>
-                <w:rFonts w:eastAsia="Calibri" w:cs="Calibri"/>
-                <w:color w:val="000000"/>
-                <w:spacing w:val="0"/>
-                <w:sz w:val="20"/>
-                <w:shd w:fill="auto" w:val="clear"/>
-              </w:rPr>
-              <w:t xml:space="preserve">Probiotica (Microbiol Platinum van Vitals of gelijkwaardig):</w:t>
-            </w:r>
-          </w:p>
-          <w:p>
-            <w:pPr>
-              <w:pStyle w:val="Normal"/>
-              <w:bidi w:val="0"/>
-              <w:spacing w:lineRule="auto" w:line="240" w:before="0" w:after="0"/>
-              <w:ind w:hanging="0" w:left="0" w:right="0"/>
-              <w:jc w:val="left"/>
-              <w:rPr>
-                <w:rFonts w:ascii="Calibri" w:hAnsi="Calibri" w:eastAsia="Calibri" w:cs="Calibri"/>
-                <w:color w:val="auto"/>
-                <w:spacing w:val="0"/>
-                <w:sz w:val="20"/>
-                <w:shd w:fill="auto" w:val="clear"/>
-              </w:rPr>
-            </w:pPr>
-            <w:r>
-              <w:rPr>
-                <w:rFonts w:eastAsia="Calibri" w:cs="Calibri"/>
-                <w:color w:val="000000"/>
-                <w:spacing w:val="0"/>
-                <w:sz w:val="20"/>
-                <w:shd w:fill="auto" w:val="clear"/>
-              </w:rPr>
               <w:t xml:space="preserve"> </w:t>
             </w:r>
             <w:r>
@@ -1715,87 +1939,7 @@
                 <w:sz w:val="20"/>
                 <w:shd w:fill="auto" w:val="clear"/>
               </w:rPr>
-              <w:t xml:space="preserve">1 capsule dagelijks vlak voor het ontbijt innemen met water</w:t>
-            </w:r>
-          </w:p>
-          <w:p>
-            <w:pPr>
-              <w:pStyle w:val="Normal"/>
-              <w:bidi w:val="0"/>
-              <w:spacing w:lineRule="auto" w:line="240" w:before="0" w:after="0"/>
-              <w:ind w:hanging="0" w:left="0" w:right="0"/>
-              <w:jc w:val="left"/>
-              <w:rPr>
-                <w:rFonts w:ascii="Calibri" w:hAnsi="Calibri" w:eastAsia="Calibri" w:cs="Calibri"/>
-                <w:color w:val="auto"/>
-                <w:spacing w:val="0"/>
-                <w:sz w:val="20"/>
-                <w:shd w:fill="auto" w:val="clear"/>
-              </w:rPr>
-            </w:pPr>
-            <w:r>
-              <w:rPr>
-                <w:rFonts w:eastAsia="Calibri" w:cs="Calibri"/>
-                <w:color w:val="000000"/>
-                <w:spacing w:val="0"/>
-                <w:sz w:val="20"/>
-                <w:shd w:fill="auto" w:val="clear"/>
-              </w:rPr>
-              <w:t xml:space="preserve"> </w:t>
-            </w:r>
-            <w:r>
-              <w:rPr/>
-              <w:t xml:space="preserve">• </w:t>
-            </w:r>
-            <w:r>
-              <w:rPr>
-                <w:rFonts w:eastAsia="Calibri" w:cs="Calibri"/>
-                <w:color w:val="000000"/>
-                <w:spacing w:val="0"/>
-                <w:sz w:val="20"/>
-                <w:shd w:fill="auto" w:val="clear"/>
-              </w:rPr>
-              <w:t xml:space="preserve">Na opening koelen bewaren volgens verpakking</w:t>
-            </w:r>
-          </w:p>
-          <w:p>
-            <w:pPr>
-              <w:pStyle w:val="Normal"/>
-              <w:bidi w:val="0"/>
-              <w:spacing w:lineRule="auto" w:line="240" w:before="0" w:after="0"/>
-              <w:ind w:hanging="0" w:left="0" w:right="0"/>
-              <w:jc w:val="left"/>
-              <w:rPr>
-                <w:rFonts w:ascii="Calibri" w:hAnsi="Calibri" w:eastAsia="Calibri" w:cs="Calibri"/>
-                <w:color w:val="auto"/>
-                <w:spacing w:val="0"/>
-                <w:sz w:val="20"/>
-                <w:shd w:fill="auto" w:val="clear"/>
-              </w:rPr>
-            </w:pPr>
-            <w:r>
-              <w:rPr>
-                <w:rFonts w:eastAsia="Calibri" w:cs="Calibri"/>
-                <w:color w:val="000000"/>
-                <w:spacing w:val="0"/>
-                <w:sz w:val="20"/>
-                <w:shd w:fill="auto" w:val="clear"/>
-              </w:rPr>
-              <w:t xml:space="preserve"> </w:t>
-            </w:r>
-            <w:r>
-              <w:rPr/>
-              <w:t xml:space="preserve">• </w:t>
-            </w:r>
-            <w:r>
-              <w:rPr>
-                <w:rFonts w:eastAsia="Calibri" w:cs="Calibri"/>
-                <w:color w:val="000000"/>
-                <w:spacing w:val="0"/>
-                <w:sz w:val="20"/>
-                <w:shd w:fill="auto" w:val="clear"/>
-              </w:rPr>
-              <w:t xml:space="preserve">Aanbevolen kuurduur: minimaal 2 maanden bij starten</w:t>
+              <w:t xml:space="preserve">Wat te verwachten: effect op klachten zoals opgeblazenheid ontwikkelt zich doorgaans over enkele weken; tijdelijke toename van winderigheid kan optreden in de beginfase.</w:t>
             </w:r>
           </w:p>
           <w:p>
@@ -2352,7 +2496,7 @@
                 <w:sz w:val="22"/>
                 <w:shd w:fill="auto" w:val="clear"/>
               </w:rPr>
-              <w:t xml:space="preserve">Pro Omega Ultra visolie (Tisso) (Pro Omega Ultra)</w:t>
+              <w:t xml:space="preserve">Pro Omega Ultra visolie van Tisso</w:t>
             </w:r>
           </w:p>
           <w:p>
@@ -3056,7 +3200,7 @@
                 <w:sz w:val="22"/>
                 <w:shd w:fill="auto" w:val="clear"/>
               </w:rPr>
-              <w:t xml:space="preserve">Vitamine D3 (Pro 1000 of gelijkwaardig)</w:t>
+              <w:t xml:space="preserve">Vitamine D3</w:t>
             </w:r>
           </w:p>
           <w:p>
@@ -3408,7 +3552,7 @@
                 <w:sz w:val="22"/>
                 <w:shd w:fill="auto" w:val="clear"/>
               </w:rPr>
-              <w:t xml:space="preserve">Probiotica (Microbiol Platinum van Vitals of gelijkwaardig)</w:t>
+              <w:t xml:space="preserve">Probiotica</w:t>
             </w:r>
           </w:p>
           <w:p>
@@ -3473,44 +3617,44 @@
                 <w:szCs w:val="24"/>
                 <w:shd w:fill="auto" w:val="clear"/>
               </w:rPr>
+              <w:t xml:space="preserve">✖</w:t>
+            </w:r>
+          </w:p>
+        </w:tc>
+        <w:tc>
+          <w:tcPr>
+            <w:tcW w:w="1108" w:type="dxa"/>
+            <w:tcBorders>
+              <w:top w:val="single" w:sz="4" w:space="0" w:color="000000"/>
+              <w:left w:val="single" w:sz="4" w:space="0" w:color="000000"/>
+              <w:bottom w:val="single" w:sz="4" w:space="0" w:color="000000"/>
+            </w:tcBorders>
+            <w:shd w:color="000000" w:fill="FFFFFF" w:val="clear"/>
+            <w:vAlign w:val="center"/>
+          </w:tcPr>
+          <w:p>
+            <w:pPr>
+              <w:pStyle w:val="Normal"/>
+              <w:spacing w:lineRule="auto" w:line="240"/>
+              <w:ind w:hanging="0" w:left="0" w:right="0"/>
+              <w:jc w:val="center"/>
+              <w:rPr>
+                <w:rFonts w:eastAsia="Calibri" w:cs="Calibri"/>
+                <w:color w:val="000000"/>
+                <w:spacing w:val="0"/>
+                <w:sz w:val="24"/>
+                <w:shd w:fill="auto" w:val="clear"/>
+              </w:rPr>
+            </w:pPr>
+            <w:r>
+              <w:rPr>
+                <w:rFonts w:eastAsia="Calibri" w:cs="Calibri"/>
+                <w:color w:val="000000"/>
+                <w:spacing w:val="0"/>
+                <w:sz w:val="24"/>
+                <w:shd w:fill="auto" w:val="clear"/>
+              </w:rPr>
               <w:t xml:space="preserve"/>
-            </w:r>
-          </w:p>
-        </w:tc>
-        <w:tc>
-          <w:tcPr>
-            <w:tcW w:w="1108" w:type="dxa"/>
-            <w:tcBorders>
-              <w:top w:val="single" w:sz="4" w:space="0" w:color="000000"/>
-              <w:left w:val="single" w:sz="4" w:space="0" w:color="000000"/>
-              <w:bottom w:val="single" w:sz="4" w:space="0" w:color="000000"/>
-            </w:tcBorders>
-            <w:shd w:color="000000" w:fill="FFFFFF" w:val="clear"/>
-            <w:vAlign w:val="center"/>
-          </w:tcPr>
-          <w:p>
-            <w:pPr>
-              <w:pStyle w:val="Normal"/>
-              <w:spacing w:lineRule="auto" w:line="240"/>
-              <w:ind w:hanging="0" w:left="0" w:right="0"/>
-              <w:jc w:val="center"/>
-              <w:rPr>
-                <w:rFonts w:eastAsia="Calibri" w:cs="Calibri"/>
-                <w:color w:val="000000"/>
-                <w:spacing w:val="0"/>
-                <w:sz w:val="24"/>
-                <w:shd w:fill="auto" w:val="clear"/>
-              </w:rPr>
-            </w:pPr>
-            <w:r>
-              <w:rPr>
-                <w:rFonts w:eastAsia="Calibri" w:cs="Calibri"/>
-                <w:color w:val="000000"/>
-                <w:spacing w:val="0"/>
-                <w:sz w:val="24"/>
-                <w:shd w:fill="auto" w:val="clear"/>
-              </w:rPr>
-              <w:t xml:space="preserve">✖</w:t>
             </w:r>
           </w:p>
         </w:tc>

</xml_diff>